<commit_message>
intento de manipulacion de la base de datos y de los ficheros
</commit_message>
<xml_diff>
--- a/UT_7_2026_2027.docx
+++ b/UT_7_2026_2027.docx
@@ -7541,7 +7541,7 @@
                 <v:path o:extrusionok="f" gradientshapeok="t" o:connecttype="rect"/>
                 <o:lock v:ext="edit" aspectratio="t"/>
               </v:shapetype>
-              <v:shape id="_x0000_i1025" type="#_x0000_t75" style="width:465.75pt;height:205.3pt">
+              <v:shape id="_x0000_i1025" type="#_x0000_t75" style="width:465.6pt;height:205.2pt">
                 <v:imagedata r:id="rId15" o:title="SecuencaciónFasesProyecto"/>
               </v:shape>
             </w:pict>
@@ -7568,7 +7568,7 @@
           </w:pPr>
           <w:r>
             <w:pict w14:anchorId="5636CC0F">
-              <v:shape id="_x0000_i1026" type="#_x0000_t75" style="width:383.2pt;height:241.8pt">
+              <v:shape id="_x0000_i1026" type="#_x0000_t75" style="width:383.4pt;height:241.8pt">
                 <v:imagedata r:id="rId16" o:title="PlanificaciónRecursosProyectos"/>
               </v:shape>
             </w:pict>
@@ -9953,6 +9953,9 @@
         </w:tc>
       </w:tr>
       <w:tr>
+        <w:trPr>
+          <w:trHeight w:val="54"/>
+        </w:trPr>
         <w:tc>
           <w:tcPr>
             <w:tcW w:w="1418" w:type="dxa"/>
@@ -11119,12 +11122,6 @@
         <w:t>Generar listado usuario</w:t>
       </w:r>
       <w:bookmarkEnd w:id="82"/>
-      <w:r>
-        <w:rPr>
-          <w:rStyle w:val="Refdenotaalpie"/>
-        </w:rPr>
-        <w:footnoteReference w:id="1"/>
-      </w:r>
     </w:p>
     <w:tbl>
       <w:tblPr>
@@ -11769,7 +11766,7 @@
       </w:pPr>
       <w:r>
         <w:pict w14:anchorId="119133E6">
-          <v:shape id="_x0000_i1027" type="#_x0000_t75" style="width:253.25pt;height:469.4pt">
+          <v:shape id="_x0000_i1027" type="#_x0000_t75" style="width:253.2pt;height:469.2pt">
             <v:imagedata r:id="rId25" o:title="DA_Login"/>
           </v:shape>
         </w:pict>
@@ -23898,7 +23895,7 @@
         <w:rPr>
           <w:rStyle w:val="Refdenotaalpie"/>
         </w:rPr>
-        <w:footnoteReference w:id="2"/>
+        <w:footnoteReference w:id="1"/>
       </w:r>
       <w:r>
         <w:t xml:space="preserve"> días. </w:t>
@@ -32775,22 +32772,6 @@
     <w:p/>
   </w:footnote>
   <w:footnote w:id="1">
-    <w:p>
-      <w:pPr>
-        <w:pStyle w:val="Textonotapie"/>
-      </w:pPr>
-      <w:r>
-        <w:rPr>
-          <w:rStyle w:val="Refdenotaalpie"/>
-        </w:rPr>
-        <w:footnoteRef/>
-      </w:r>
-      <w:r>
-        <w:t xml:space="preserve"> Supongamos que el RF7 nos pide gestionar una lista de administradores y profesores que están registrados en el sistema, con todos sus datos aparte de la clave de acceso.</w:t>
-      </w:r>
-    </w:p>
-  </w:footnote>
-  <w:footnote w:id="2">
     <w:p>
       <w:pPr>
         <w:pStyle w:val="Textonotapie"/>
@@ -36393,6 +36374,7 @@
     <w:rsid w:val="0081382F"/>
     <w:rsid w:val="00893BCB"/>
     <w:rsid w:val="008960CF"/>
+    <w:rsid w:val="0090208C"/>
     <w:rsid w:val="009051C9"/>
     <w:rsid w:val="00962633"/>
     <w:rsid w:val="00963B15"/>
@@ -36407,6 +36389,7 @@
     <w:rsid w:val="00A71D6A"/>
     <w:rsid w:val="00A94268"/>
     <w:rsid w:val="00AC11EA"/>
+    <w:rsid w:val="00AC757F"/>
     <w:rsid w:val="00B17BB1"/>
     <w:rsid w:val="00B444FF"/>
     <w:rsid w:val="00BA03CE"/>
@@ -36428,10 +36411,12 @@
     <w:rsid w:val="00E03F4D"/>
     <w:rsid w:val="00E1070B"/>
     <w:rsid w:val="00E32BA3"/>
+    <w:rsid w:val="00EB2B91"/>
     <w:rsid w:val="00F43476"/>
     <w:rsid w:val="00F46697"/>
     <w:rsid w:val="00F5150F"/>
     <w:rsid w:val="00FA2BCD"/>
+    <w:rsid w:val="00FB3069"/>
     <w:rsid w:val="00FD51C7"/>
   </w:rsids>
   <m:mathPr>

</xml_diff>

<commit_message>
creo que ya está completamente funcional
</commit_message>
<xml_diff>
--- a/UT_7_2026_2027.docx
+++ b/UT_7_2026_2027.docx
@@ -6043,9 +6043,9 @@
       </w:r>
     </w:p>
     <w:p/>
-    <w:bookmarkStart w:id="6" w:name="_Toc49341785" w:displacedByCustomXml="next"/>
+    <w:bookmarkStart w:id="6" w:name="_Toc182500112" w:displacedByCustomXml="next"/>
     <w:bookmarkStart w:id="7" w:name="_Toc182218937" w:displacedByCustomXml="next"/>
-    <w:bookmarkStart w:id="8" w:name="_Toc182500112" w:displacedByCustomXml="next"/>
+    <w:bookmarkStart w:id="8" w:name="_Toc49341785" w:displacedByCustomXml="next"/>
     <w:sdt>
       <w:sdtPr>
         <w:rPr>
@@ -7051,15 +7051,28 @@
                   </w:rPr>
                   <w:t xml:space="preserve">oftware draw.io </w:t>
                 </w:r>
-                <w:hyperlink r:id="rId14" w:history="1">
-                  <w:r>
-                    <w:rPr>
-                      <w:rStyle w:val="Hipervnculo"/>
-                      <w:lang w:val="en-US"/>
-                    </w:rPr>
-                    <w:t>https://app.diagrams.net/</w:t>
-                  </w:r>
-                </w:hyperlink>
+                <w:r>
+                  <w:fldChar w:fldCharType="begin"/>
+                </w:r>
+                <w:r>
+                  <w:rPr>
+                    <w:lang w:val="en-US"/>
+                  </w:rPr>
+                  <w:instrText>HYPERLINK "https://app.diagrams.net/"</w:instrText>
+                </w:r>
+                <w:r>
+                  <w:fldChar w:fldCharType="separate"/>
+                </w:r>
+                <w:r>
+                  <w:rPr>
+                    <w:rStyle w:val="Hipervnculo"/>
+                    <w:lang w:val="en-US"/>
+                  </w:rPr>
+                  <w:t>https://app.diagrams.net/</w:t>
+                </w:r>
+                <w:r>
+                  <w:fldChar w:fldCharType="end"/>
+                </w:r>
               </w:p>
             </w:tc>
           </w:tr>
@@ -7541,8 +7554,8 @@
                 <v:path o:extrusionok="f" gradientshapeok="t" o:connecttype="rect"/>
                 <o:lock v:ext="edit" aspectratio="t"/>
               </v:shapetype>
-              <v:shape id="_x0000_i1025" type="#_x0000_t75" style="width:465.6pt;height:205.2pt">
-                <v:imagedata r:id="rId15" o:title="SecuencaciónFasesProyecto"/>
+              <v:shape id="_x0000_i1025" type="#_x0000_t75" style="width:465.75pt;height:205.3pt">
+                <v:imagedata r:id="rId14" o:title="SecuencaciónFasesProyecto"/>
               </v:shape>
             </w:pict>
           </w:r>
@@ -7568,8 +7581,8 @@
           </w:pPr>
           <w:r>
             <w:pict w14:anchorId="5636CC0F">
-              <v:shape id="_x0000_i1026" type="#_x0000_t75" style="width:383.4pt;height:241.8pt">
-                <v:imagedata r:id="rId16" o:title="PlanificaciónRecursosProyectos"/>
+              <v:shape id="_x0000_i1026" type="#_x0000_t75" style="width:383.2pt;height:241.8pt">
+                <v:imagedata r:id="rId15" o:title="PlanificaciónRecursosProyectos"/>
               </v:shape>
             </w:pict>
           </w:r>
@@ -7687,7 +7700,7 @@
                     </pic:cNvPicPr>
                   </pic:nvPicPr>
                   <pic:blipFill>
-                    <a:blip r:embed="rId17">
+                    <a:blip r:embed="rId16">
                       <a:extLst>
                         <a:ext uri="{28A0092B-C50C-407E-A947-70E740481C1C}">
                           <a14:useLocalDpi xmlns:a14="http://schemas.microsoft.com/office/drawing/2010/main" val="0"/>
@@ -7772,7 +7785,7 @@
                     </pic:cNvPicPr>
                   </pic:nvPicPr>
                   <pic:blipFill>
-                    <a:blip r:embed="rId18">
+                    <a:blip r:embed="rId17">
                       <a:extLst>
                         <a:ext uri="{28A0092B-C50C-407E-A947-70E740481C1C}">
                           <a14:useLocalDpi xmlns:a14="http://schemas.microsoft.com/office/drawing/2010/main" val="0"/>
@@ -7846,6 +7859,107 @@
                 <pic:pic xmlns:pic="http://schemas.openxmlformats.org/drawingml/2006/picture">
                   <pic:nvPicPr>
                     <pic:cNvPr id="0" name="Picture 24"/>
+                    <pic:cNvPicPr>
+                      <a:picLocks noChangeAspect="1" noChangeArrowheads="1"/>
+                    </pic:cNvPicPr>
+                  </pic:nvPicPr>
+                  <pic:blipFill>
+                    <a:blip r:embed="rId18">
+                      <a:extLst>
+                        <a:ext uri="{28A0092B-C50C-407E-A947-70E740481C1C}">
+                          <a14:useLocalDpi xmlns:a14="http://schemas.microsoft.com/office/drawing/2010/main" val="0"/>
+                        </a:ext>
+                      </a:extLst>
+                    </a:blip>
+                    <a:srcRect/>
+                    <a:stretch>
+                      <a:fillRect/>
+                    </a:stretch>
+                  </pic:blipFill>
+                  <pic:spPr bwMode="auto">
+                    <a:xfrm>
+                      <a:off x="0" y="0"/>
+                      <a:ext cx="1932305" cy="2303145"/>
+                    </a:xfrm>
+                    <a:prstGeom prst="rect">
+                      <a:avLst/>
+                    </a:prstGeom>
+                    <a:noFill/>
+                    <a:ln>
+                      <a:noFill/>
+                    </a:ln>
+                  </pic:spPr>
+                </pic:pic>
+              </a:graphicData>
+            </a:graphic>
+          </wp:inline>
+        </w:drawing>
+      </w:r>
+    </w:p>
+    <w:p>
+      <w:pPr>
+        <w:spacing w:after="200"/>
+        <w:jc w:val="left"/>
+        <w:rPr>
+          <w:rFonts w:asciiTheme="majorHAnsi" w:eastAsiaTheme="majorEastAsia" w:hAnsiTheme="majorHAnsi" w:cstheme="majorBidi"/>
+          <w:b/>
+          <w:color w:val="012639" w:themeColor="accent1" w:themeShade="7F"/>
+        </w:rPr>
+      </w:pPr>
+      <w:r>
+        <w:br w:type="page"/>
+      </w:r>
+    </w:p>
+    <w:p>
+      <w:pPr>
+        <w:pStyle w:val="Ttulo3"/>
+      </w:pPr>
+      <w:bookmarkStart w:id="65" w:name="_Toc182218957"/>
+      <w:bookmarkStart w:id="66" w:name="_Toc182500132"/>
+      <w:r>
+        <w:lastRenderedPageBreak/>
+        <w:t xml:space="preserve">Dar de </w:t>
+      </w:r>
+      <w:r>
+        <w:t>baja</w:t>
+      </w:r>
+      <w:r>
+        <w:t xml:space="preserve"> guard</w:t>
+      </w:r>
+      <w:r>
+        <w:t>i</w:t>
+      </w:r>
+      <w:r>
+        <w:t xml:space="preserve">as </w:t>
+      </w:r>
+      <w:r>
+        <w:t>(RF5)</w:t>
+      </w:r>
+      <w:bookmarkEnd w:id="65"/>
+      <w:bookmarkEnd w:id="66"/>
+    </w:p>
+    <w:p/>
+    <w:p>
+      <w:pPr>
+        <w:jc w:val="center"/>
+      </w:pPr>
+      <w:r>
+        <w:rPr>
+          <w:noProof/>
+        </w:rPr>
+        <w:drawing>
+          <wp:inline distT="0" distB="0" distL="0" distR="0" wp14:anchorId="6E0521DC" wp14:editId="06446BE0">
+            <wp:extent cx="1932305" cy="2303145"/>
+            <wp:effectExtent l="0" t="0" r="0" b="1905"/>
+            <wp:docPr id="51" name="Imagen 51"/>
+            <wp:cNvGraphicFramePr>
+              <a:graphicFrameLocks xmlns:a="http://schemas.openxmlformats.org/drawingml/2006/main" noChangeAspect="1"/>
+            </wp:cNvGraphicFramePr>
+            <a:graphic xmlns:a="http://schemas.openxmlformats.org/drawingml/2006/main">
+              <a:graphicData uri="http://schemas.openxmlformats.org/drawingml/2006/picture">
+                <pic:pic xmlns:pic="http://schemas.openxmlformats.org/drawingml/2006/picture">
+                  <pic:nvPicPr>
+                    <pic:cNvPr id="0" name="Picture 26"/>
                     <pic:cNvPicPr>
                       <a:picLocks noChangeAspect="1" noChangeArrowheads="1"/>
                     </pic:cNvPicPr>
@@ -7885,107 +7999,6 @@
     </w:p>
     <w:p>
       <w:pPr>
-        <w:spacing w:after="200"/>
-        <w:jc w:val="left"/>
-        <w:rPr>
-          <w:rFonts w:asciiTheme="majorHAnsi" w:eastAsiaTheme="majorEastAsia" w:hAnsiTheme="majorHAnsi" w:cstheme="majorBidi"/>
-          <w:b/>
-          <w:color w:val="012639" w:themeColor="accent1" w:themeShade="7F"/>
-        </w:rPr>
-      </w:pPr>
-      <w:r>
-        <w:br w:type="page"/>
-      </w:r>
-    </w:p>
-    <w:p>
-      <w:pPr>
-        <w:pStyle w:val="Ttulo3"/>
-      </w:pPr>
-      <w:bookmarkStart w:id="65" w:name="_Toc182218957"/>
-      <w:bookmarkStart w:id="66" w:name="_Toc182500132"/>
-      <w:r>
-        <w:lastRenderedPageBreak/>
-        <w:t xml:space="preserve">Dar de </w:t>
-      </w:r>
-      <w:r>
-        <w:t>baja</w:t>
-      </w:r>
-      <w:r>
-        <w:t xml:space="preserve"> guard</w:t>
-      </w:r>
-      <w:r>
-        <w:t>i</w:t>
-      </w:r>
-      <w:r>
-        <w:t xml:space="preserve">as </w:t>
-      </w:r>
-      <w:r>
-        <w:t>(RF5)</w:t>
-      </w:r>
-      <w:bookmarkEnd w:id="65"/>
-      <w:bookmarkEnd w:id="66"/>
-    </w:p>
-    <w:p/>
-    <w:p>
-      <w:pPr>
-        <w:jc w:val="center"/>
-      </w:pPr>
-      <w:r>
-        <w:rPr>
-          <w:noProof/>
-        </w:rPr>
-        <w:drawing>
-          <wp:inline distT="0" distB="0" distL="0" distR="0" wp14:anchorId="6E0521DC" wp14:editId="06446BE0">
-            <wp:extent cx="1932305" cy="2303145"/>
-            <wp:effectExtent l="0" t="0" r="0" b="1905"/>
-            <wp:docPr id="51" name="Imagen 51"/>
-            <wp:cNvGraphicFramePr>
-              <a:graphicFrameLocks xmlns:a="http://schemas.openxmlformats.org/drawingml/2006/main" noChangeAspect="1"/>
-            </wp:cNvGraphicFramePr>
-            <a:graphic xmlns:a="http://schemas.openxmlformats.org/drawingml/2006/main">
-              <a:graphicData uri="http://schemas.openxmlformats.org/drawingml/2006/picture">
-                <pic:pic xmlns:pic="http://schemas.openxmlformats.org/drawingml/2006/picture">
-                  <pic:nvPicPr>
-                    <pic:cNvPr id="0" name="Picture 26"/>
-                    <pic:cNvPicPr>
-                      <a:picLocks noChangeAspect="1" noChangeArrowheads="1"/>
-                    </pic:cNvPicPr>
-                  </pic:nvPicPr>
-                  <pic:blipFill>
-                    <a:blip r:embed="rId20">
-                      <a:extLst>
-                        <a:ext uri="{28A0092B-C50C-407E-A947-70E740481C1C}">
-                          <a14:useLocalDpi xmlns:a14="http://schemas.microsoft.com/office/drawing/2010/main" val="0"/>
-                        </a:ext>
-                      </a:extLst>
-                    </a:blip>
-                    <a:srcRect/>
-                    <a:stretch>
-                      <a:fillRect/>
-                    </a:stretch>
-                  </pic:blipFill>
-                  <pic:spPr bwMode="auto">
-                    <a:xfrm>
-                      <a:off x="0" y="0"/>
-                      <a:ext cx="1932305" cy="2303145"/>
-                    </a:xfrm>
-                    <a:prstGeom prst="rect">
-                      <a:avLst/>
-                    </a:prstGeom>
-                    <a:noFill/>
-                    <a:ln>
-                      <a:noFill/>
-                    </a:ln>
-                  </pic:spPr>
-                </pic:pic>
-              </a:graphicData>
-            </a:graphic>
-          </wp:inline>
-        </w:drawing>
-      </w:r>
-    </w:p>
-    <w:p>
-      <w:pPr>
         <w:pStyle w:val="Ttulo3"/>
       </w:pPr>
       <w:bookmarkStart w:id="67" w:name="_Toc182218958"/>
@@ -8026,7 +8039,7 @@
                     <pic:cNvPicPr/>
                   </pic:nvPicPr>
                   <pic:blipFill>
-                    <a:blip r:embed="rId21">
+                    <a:blip r:embed="rId20">
                       <a:extLst>
                         <a:ext uri="{28A0092B-C50C-407E-A947-70E740481C1C}">
                           <a14:useLocalDpi xmlns:a14="http://schemas.microsoft.com/office/drawing/2010/main" val="0"/>
@@ -8092,7 +8105,7 @@
                     <pic:cNvPicPr/>
                   </pic:nvPicPr>
                   <pic:blipFill>
-                    <a:blip r:embed="rId22">
+                    <a:blip r:embed="rId21">
                       <a:extLst>
                         <a:ext uri="{28A0092B-C50C-407E-A947-70E740481C1C}">
                           <a14:useLocalDpi xmlns:a14="http://schemas.microsoft.com/office/drawing/2010/main" val="0"/>
@@ -11570,7 +11583,7 @@
                     </pic:cNvPicPr>
                   </pic:nvPicPr>
                   <pic:blipFill>
-                    <a:blip r:embed="rId23">
+                    <a:blip r:embed="rId22">
                       <a:extLst>
                         <a:ext uri="{28A0092B-C50C-407E-A947-70E740481C1C}">
                           <a14:useLocalDpi xmlns:a14="http://schemas.microsoft.com/office/drawing/2010/main" val="0"/>
@@ -11673,7 +11686,7 @@
                     </pic:cNvPicPr>
                   </pic:nvPicPr>
                   <pic:blipFill>
-                    <a:blip r:embed="rId24">
+                    <a:blip r:embed="rId23">
                       <a:extLst>
                         <a:ext uri="{28A0092B-C50C-407E-A947-70E740481C1C}">
                           <a14:useLocalDpi xmlns:a14="http://schemas.microsoft.com/office/drawing/2010/main" val="0"/>
@@ -11766,8 +11779,8 @@
       </w:pPr>
       <w:r>
         <w:pict w14:anchorId="119133E6">
-          <v:shape id="_x0000_i1027" type="#_x0000_t75" style="width:253.2pt;height:469.2pt">
-            <v:imagedata r:id="rId25" o:title="DA_Login"/>
+          <v:shape id="_x0000_i1027" type="#_x0000_t75" style="width:253.25pt;height:469.4pt">
+            <v:imagedata r:id="rId24" o:title="DA_Login"/>
           </v:shape>
         </w:pict>
       </w:r>
@@ -11797,7 +11810,7 @@
                     </pic:cNvPicPr>
                   </pic:nvPicPr>
                   <pic:blipFill>
-                    <a:blip r:embed="rId26">
+                    <a:blip r:embed="rId25">
                       <a:extLst>
                         <a:ext uri="{28A0092B-C50C-407E-A947-70E740481C1C}">
                           <a14:useLocalDpi xmlns:a14="http://schemas.microsoft.com/office/drawing/2010/main" val="0"/>
@@ -11852,8 +11865,8 @@
       <w:pPr>
         <w:pStyle w:val="Ttulo3"/>
         <w:sectPr>
-          <w:headerReference w:type="default" r:id="rId27"/>
-          <w:footerReference w:type="default" r:id="rId28"/>
+          <w:headerReference w:type="default" r:id="rId26"/>
+          <w:footerReference w:type="default" r:id="rId27"/>
           <w:pgSz w:w="11906" w:h="16838" w:code="9"/>
           <w:pgMar w:top="1291" w:right="936" w:bottom="720" w:left="936" w:header="0" w:footer="289" w:gutter="0"/>
           <w:pgNumType w:start="1"/>
@@ -11915,7 +11928,7 @@
                     </pic:cNvPicPr>
                   </pic:nvPicPr>
                   <pic:blipFill>
-                    <a:blip r:embed="rId29">
+                    <a:blip r:embed="rId28">
                       <a:extLst>
                         <a:ext uri="{28A0092B-C50C-407E-A947-70E740481C1C}">
                           <a14:useLocalDpi xmlns:a14="http://schemas.microsoft.com/office/drawing/2010/main" val="0"/>
@@ -11985,7 +11998,7 @@
                     </pic:cNvPicPr>
                   </pic:nvPicPr>
                   <pic:blipFill>
-                    <a:blip r:embed="rId30">
+                    <a:blip r:embed="rId29">
                       <a:extLst>
                         <a:ext uri="{28A0092B-C50C-407E-A947-70E740481C1C}">
                           <a14:useLocalDpi xmlns:a14="http://schemas.microsoft.com/office/drawing/2010/main" val="0"/>
@@ -12100,7 +12113,7 @@
                     </pic:cNvPicPr>
                   </pic:nvPicPr>
                   <pic:blipFill>
-                    <a:blip r:embed="rId31">
+                    <a:blip r:embed="rId30">
                       <a:extLst>
                         <a:ext uri="{28A0092B-C50C-407E-A947-70E740481C1C}">
                           <a14:useLocalDpi xmlns:a14="http://schemas.microsoft.com/office/drawing/2010/main" val="0"/>
@@ -12174,7 +12187,7 @@
                     </pic:cNvPicPr>
                   </pic:nvPicPr>
                   <pic:blipFill>
-                    <a:blip r:embed="rId32">
+                    <a:blip r:embed="rId31">
                       <a:extLst>
                         <a:ext uri="{28A0092B-C50C-407E-A947-70E740481C1C}">
                           <a14:useLocalDpi xmlns:a14="http://schemas.microsoft.com/office/drawing/2010/main" val="0"/>
@@ -12264,7 +12277,7 @@
                     <pic:cNvPicPr/>
                   </pic:nvPicPr>
                   <pic:blipFill>
-                    <a:blip r:embed="rId33">
+                    <a:blip r:embed="rId32">
                       <a:extLst>
                         <a:ext uri="{28A0092B-C50C-407E-A947-70E740481C1C}">
                           <a14:useLocalDpi xmlns:a14="http://schemas.microsoft.com/office/drawing/2010/main" val="0"/>
@@ -12324,7 +12337,7 @@
                     <pic:cNvPicPr/>
                   </pic:nvPicPr>
                   <pic:blipFill>
-                    <a:blip r:embed="rId34">
+                    <a:blip r:embed="rId33">
                       <a:extLst>
                         <a:ext uri="{28A0092B-C50C-407E-A947-70E740481C1C}">
                           <a14:useLocalDpi xmlns:a14="http://schemas.microsoft.com/office/drawing/2010/main" val="0"/>
@@ -12428,7 +12441,7 @@
                     </pic:cNvPicPr>
                   </pic:nvPicPr>
                   <pic:blipFill>
-                    <a:blip r:embed="rId35">
+                    <a:blip r:embed="rId34">
                       <a:extLst>
                         <a:ext uri="{28A0092B-C50C-407E-A947-70E740481C1C}">
                           <a14:useLocalDpi xmlns:a14="http://schemas.microsoft.com/office/drawing/2010/main" val="0"/>
@@ -12700,14 +12713,6 @@
           <w:color w:val="EE0000"/>
         </w:rPr>
       </w:pPr>
-      <w:proofErr w:type="gramStart"/>
-      <w:r>
-        <w:rPr>
-          <w:color w:val="EE0000"/>
-        </w:rPr>
-        <w:t>El id en guardias no es una FK del id de profesores????????</w:t>
-      </w:r>
-      <w:proofErr w:type="gramEnd"/>
     </w:p>
     <w:tbl>
       <w:tblPr>
@@ -24200,7 +24205,7 @@
                         </pic:cNvPicPr>
                       </pic:nvPicPr>
                       <pic:blipFill>
-                        <a:blip r:embed="rId36" cstate="print">
+                        <a:blip r:embed="rId35" cstate="print">
                           <a:extLst>
                             <a:ext uri="{28A0092B-C50C-407E-A947-70E740481C1C}">
                               <a14:useLocalDpi xmlns:a14="http://schemas.microsoft.com/office/drawing/2010/main" val="0"/>
@@ -36320,6 +36325,7 @@
     <w:rsid w:val="00112C1E"/>
     <w:rsid w:val="001370FA"/>
     <w:rsid w:val="001C2BE8"/>
+    <w:rsid w:val="00213D2D"/>
     <w:rsid w:val="00216802"/>
     <w:rsid w:val="00236FE3"/>
     <w:rsid w:val="002416C9"/>
@@ -36410,6 +36416,7 @@
     <w:rsid w:val="00D83739"/>
     <w:rsid w:val="00E03F4D"/>
     <w:rsid w:val="00E1070B"/>
+    <w:rsid w:val="00E149A6"/>
     <w:rsid w:val="00E32BA3"/>
     <w:rsid w:val="00EB2B91"/>
     <w:rsid w:val="00F43476"/>

</xml_diff>